<commit_message>
primer intento de gráfica ondulatorio
</commit_message>
<xml_diff>
--- a/Doble Rendija/Actividad 1.docx
+++ b/Doble Rendija/Actividad 1.docx
@@ -43,7 +43,19 @@
         <w:rPr>
           <w:lang w:val="es-ES"/>
         </w:rPr>
-        <w:t>Es importante mencionar que no había tarjetas en el laboratorio, por lo que, fue necesario implementar un papelito para ver el patrón lo que puede dificultar a la observación de las experimentalistas.</w:t>
+        <w:t xml:space="preserve">Es importante mencionar que no había tarjetas en el laboratorio, por lo que, fue necesario implementar un papelito </w:t>
+      </w:r>
+      <w:r>
+        <w:rPr>
+          <w:lang w:val="es-ES"/>
+        </w:rPr>
+        <w:t>amarillo rayado para</w:t>
+      </w:r>
+      <w:r>
+        <w:rPr>
+          <w:lang w:val="es-ES"/>
+        </w:rPr>
+        <w:t xml:space="preserve"> ver el patrón lo que puede dificultar a la observación de las experimentalistas.</w:t>
       </w:r>
     </w:p>
     <w:p>
@@ -69,21 +81,31 @@
         <w:rPr>
           <w:lang w:val="es-ES"/>
         </w:rPr>
-        <w:t xml:space="preserve">Se </w:t>
-      </w:r>
-      <w:proofErr w:type="spellStart"/>
-      <w:r>
-        <w:rPr>
-          <w:lang w:val="es-ES"/>
-        </w:rPr>
-        <w:t>vió</w:t>
-      </w:r>
-      <w:proofErr w:type="spellEnd"/>
-      <w:r>
-        <w:rPr>
-          <w:lang w:val="es-ES"/>
-        </w:rPr>
-        <w:t xml:space="preserve"> que hay una interferencia destructiva y constructiva que es bastante visible al formar rayas sin luz de forma vertical.</w:t>
+        <w:t>Se vi</w:t>
+      </w:r>
+      <w:r>
+        <w:rPr>
+          <w:lang w:val="es-ES"/>
+        </w:rPr>
+        <w:t>o</w:t>
+      </w:r>
+      <w:r>
+        <w:rPr>
+          <w:lang w:val="es-ES"/>
+        </w:rPr>
+        <w:t xml:space="preserve"> que hay una interferencia destructiva y constructiva que es bastante visible al formar rayas de forma vertical</w:t>
+      </w:r>
+      <w:r>
+        <w:rPr>
+          <w:lang w:val="es-ES"/>
+        </w:rPr>
+        <w:t xml:space="preserve"> en las cuales no había como tal luz</w:t>
+      </w:r>
+      <w:r>
+        <w:rPr>
+          <w:lang w:val="es-ES"/>
+        </w:rPr>
+        <w:t>.</w:t>
       </w:r>
     </w:p>
     <w:p>
@@ -119,7 +141,27 @@
         <w:rPr>
           <w:lang w:val="es-ES"/>
         </w:rPr>
-        <w:t>Se ve negro porque no pasa luz como tal.</w:t>
+        <w:t xml:space="preserve">Solo se </w:t>
+      </w:r>
+      <w:proofErr w:type="spellStart"/>
+      <w:r>
+        <w:rPr>
+          <w:lang w:val="es-ES"/>
+        </w:rPr>
+        <w:t>vió</w:t>
+      </w:r>
+      <w:proofErr w:type="spellEnd"/>
+      <w:r>
+        <w:rPr>
+          <w:lang w:val="es-ES"/>
+        </w:rPr>
+        <w:t xml:space="preserve"> el color del papel </w:t>
+      </w:r>
+      <w:r>
+        <w:rPr>
+          <w:lang w:val="es-ES"/>
+        </w:rPr>
+        <w:t>porque no pasa luz como tal.</w:t>
       </w:r>
     </w:p>
     <w:p>
@@ -258,7 +300,7 @@
             <wp:cNvGraphicFramePr/>
             <a:graphic xmlns:a="http://schemas.openxmlformats.org/drawingml/2006/main">
               <a:graphicData uri="http://schemas.openxmlformats.org/drawingml/2006/chart">
-                <c:chart xmlns:c="http://schemas.openxmlformats.org/drawingml/2006/chart" xmlns:r="http://schemas.openxmlformats.org/officeDocument/2006/relationships" r:id="rId5"/>
+                <c:chart xmlns:c="http://schemas.openxmlformats.org/drawingml/2006/chart" xmlns:r="http://schemas.openxmlformats.org/officeDocument/2006/relationships" r:id="rId7"/>
               </a:graphicData>
             </a:graphic>
           </wp:inline>
@@ -307,7 +349,7 @@
             <wp:cNvGraphicFramePr/>
             <a:graphic xmlns:a="http://schemas.openxmlformats.org/drawingml/2006/main">
               <a:graphicData uri="http://schemas.openxmlformats.org/drawingml/2006/chart">
-                <c:chart xmlns:c="http://schemas.openxmlformats.org/drawingml/2006/chart" xmlns:r="http://schemas.openxmlformats.org/officeDocument/2006/relationships" r:id="rId6"/>
+                <c:chart xmlns:c="http://schemas.openxmlformats.org/drawingml/2006/chart" xmlns:r="http://schemas.openxmlformats.org/officeDocument/2006/relationships" r:id="rId8"/>
               </a:graphicData>
             </a:graphic>
           </wp:inline>
@@ -4404,13 +4446,7 @@
         <w:rPr>
           <w:lang w:val="es-ES"/>
         </w:rPr>
-        <w:t xml:space="preserve"> </w:t>
-      </w:r>
-      <w:r>
-        <w:rPr>
-          <w:lang w:val="es-ES"/>
-        </w:rPr>
-        <w:t>Puede calcular en promedio cada cu</w:t>
+        <w:t xml:space="preserve"> Puede calcular en promedio cada cu</w:t>
       </w:r>
       <w:r>
         <w:rPr>
@@ -4434,19 +4470,7 @@
         <w:rPr>
           <w:lang w:val="es-ES"/>
         </w:rPr>
-        <w:t xml:space="preserve"> al</w:t>
-      </w:r>
-      <w:r>
-        <w:rPr>
-          <w:lang w:val="es-ES"/>
-        </w:rPr>
-        <w:t xml:space="preserve"> </w:t>
-      </w:r>
-      <w:r>
-        <w:rPr>
-          <w:lang w:val="es-ES"/>
-        </w:rPr>
-        <w:t>detector y compararlo con el tiempo de vuelo desde la fuente hasta el detecto</w:t>
+        <w:t xml:space="preserve"> al detector y compararlo con el tiempo de vuelo desde la fuente hasta el detecto</w:t>
       </w:r>
       <w:r>
         <w:rPr>
@@ -4781,6 +4805,12 @@
       </w:r>
     </w:p>
     <w:sectPr>
+      <w:headerReference w:type="even" r:id="rId9"/>
+      <w:headerReference w:type="default" r:id="rId10"/>
+      <w:footerReference w:type="even" r:id="rId11"/>
+      <w:footerReference w:type="default" r:id="rId12"/>
+      <w:headerReference w:type="first" r:id="rId13"/>
+      <w:footerReference w:type="first" r:id="rId14"/>
       <w:pgSz w:w="11906" w:h="16838"/>
       <w:pgMar w:top="1417" w:right="1701" w:bottom="1417" w:left="1701" w:header="708" w:footer="708" w:gutter="0"/>
       <w:cols w:space="708"/>
@@ -4788,6 +4818,116 @@
     </w:sectPr>
   </w:body>
 </w:document>
+</file>
+
+<file path=word/endnotes.xml><?xml version="1.0" encoding="utf-8"?>
+<w:endnotes xmlns:wpc="http://schemas.microsoft.com/office/word/2010/wordprocessingCanvas" xmlns:cx="http://schemas.microsoft.com/office/drawing/2014/chartex" xmlns:cx1="http://schemas.microsoft.com/office/drawing/2015/9/8/chartex" xmlns:cx2="http://schemas.microsoft.com/office/drawing/2015/10/21/chartex" xmlns:cx3="http://schemas.microsoft.com/office/drawing/2016/5/9/chartex" xmlns:cx4="http://schemas.microsoft.com/office/drawing/2016/5/10/chartex" xmlns:cx5="http://schemas.microsoft.com/office/drawing/2016/5/11/chartex" xmlns:cx6="http://schemas.microsoft.com/office/drawing/2016/5/12/chartex" xmlns:cx7="http://schemas.microsoft.com/office/drawing/2016/5/13/chartex" xmlns:cx8="http://schemas.microsoft.com/office/drawing/2016/5/14/chartex" xmlns:mc="http://schemas.openxmlformats.org/markup-compatibility/2006" xmlns:aink="http://schemas.microsoft.com/office/drawing/2016/ink" xmlns:am3d="http://schemas.microsoft.com/office/drawing/2017/model3d" xmlns:o="urn:schemas-microsoft-com:office:office" xmlns:oel="http://schemas.microsoft.com/office/2019/extlst" xmlns:r="http://schemas.openxmlformats.org/officeDocument/2006/relationships" xmlns:m="http://schemas.openxmlformats.org/officeDocument/2006/math" xmlns:v="urn:schemas-microsoft-com:vml" xmlns:wp14="http://schemas.microsoft.com/office/word/2010/wordprocessingDrawing" xmlns:wp="http://schemas.openxmlformats.org/drawingml/2006/wordprocessingDrawing" xmlns:w10="urn:schemas-microsoft-com:office:word" xmlns:w="http://schemas.openxmlformats.org/wordprocessingml/2006/main" xmlns:w14="http://schemas.microsoft.com/office/word/2010/wordml" xmlns:w15="http://schemas.microsoft.com/office/word/2012/wordml" xmlns:w16cex="http://schemas.microsoft.com/office/word/2018/wordml/cex" xmlns:w16cid="http://schemas.microsoft.com/office/word/2016/wordml/cid" xmlns:w16="http://schemas.microsoft.com/office/word/2018/wordml" xmlns:w16du="http://schemas.microsoft.com/office/word/2023/wordml/word16du" xmlns:w16sdtdh="http://schemas.microsoft.com/office/word/2020/wordml/sdtdatahash" xmlns:w16sdtfl="http://schemas.microsoft.com/office/word/2024/wordml/sdtformatlock" xmlns:w16se="http://schemas.microsoft.com/office/word/2015/wordml/symex" xmlns:wpg="http://schemas.microsoft.com/office/word/2010/wordprocessingGroup" xmlns:wpi="http://schemas.microsoft.com/office/word/2010/wordprocessingInk" xmlns:wne="http://schemas.microsoft.com/office/word/2006/wordml" xmlns:wps="http://schemas.microsoft.com/office/word/2010/wordprocessingShape" mc:Ignorable="w14 w15 w16se w16cid w16 w16cex w16sdtdh w16sdtfl w16du wp14">
+  <w:endnote w:type="separator" w:id="-1">
+    <w:p>
+      <w:pPr>
+        <w:spacing w:after="0" w:line="240" w:lineRule="auto"/>
+      </w:pPr>
+      <w:r>
+        <w:separator/>
+      </w:r>
+    </w:p>
+  </w:endnote>
+  <w:endnote w:type="continuationSeparator" w:id="0">
+    <w:p>
+      <w:pPr>
+        <w:spacing w:after="0" w:line="240" w:lineRule="auto"/>
+      </w:pPr>
+      <w:r>
+        <w:continuationSeparator/>
+      </w:r>
+    </w:p>
+  </w:endnote>
+</w:endnotes>
+</file>
+
+<file path=word/footer1.xml><?xml version="1.0" encoding="utf-8"?>
+<w:ftr xmlns:wpc="http://schemas.microsoft.com/office/word/2010/wordprocessingCanvas" xmlns:cx="http://schemas.microsoft.com/office/drawing/2014/chartex" xmlns:cx1="http://schemas.microsoft.com/office/drawing/2015/9/8/chartex" xmlns:cx2="http://schemas.microsoft.com/office/drawing/2015/10/21/chartex" xmlns:cx3="http://schemas.microsoft.com/office/drawing/2016/5/9/chartex" xmlns:cx4="http://schemas.microsoft.com/office/drawing/2016/5/10/chartex" xmlns:cx5="http://schemas.microsoft.com/office/drawing/2016/5/11/chartex" xmlns:cx6="http://schemas.microsoft.com/office/drawing/2016/5/12/chartex" xmlns:cx7="http://schemas.microsoft.com/office/drawing/2016/5/13/chartex" xmlns:cx8="http://schemas.microsoft.com/office/drawing/2016/5/14/chartex" xmlns:mc="http://schemas.openxmlformats.org/markup-compatibility/2006" xmlns:aink="http://schemas.microsoft.com/office/drawing/2016/ink" xmlns:am3d="http://schemas.microsoft.com/office/drawing/2017/model3d" xmlns:o="urn:schemas-microsoft-com:office:office" xmlns:oel="http://schemas.microsoft.com/office/2019/extlst" xmlns:r="http://schemas.openxmlformats.org/officeDocument/2006/relationships" xmlns:m="http://schemas.openxmlformats.org/officeDocument/2006/math" xmlns:v="urn:schemas-microsoft-com:vml" xmlns:wp14="http://schemas.microsoft.com/office/word/2010/wordprocessingDrawing" xmlns:wp="http://schemas.openxmlformats.org/drawingml/2006/wordprocessingDrawing" xmlns:w10="urn:schemas-microsoft-com:office:word" xmlns:w="http://schemas.openxmlformats.org/wordprocessingml/2006/main" xmlns:w14="http://schemas.microsoft.com/office/word/2010/wordml" xmlns:w15="http://schemas.microsoft.com/office/word/2012/wordml" xmlns:w16cex="http://schemas.microsoft.com/office/word/2018/wordml/cex" xmlns:w16cid="http://schemas.microsoft.com/office/word/2016/wordml/cid" xmlns:w16="http://schemas.microsoft.com/office/word/2018/wordml" xmlns:w16du="http://schemas.microsoft.com/office/word/2023/wordml/word16du" xmlns:w16sdtdh="http://schemas.microsoft.com/office/word/2020/wordml/sdtdatahash" xmlns:w16sdtfl="http://schemas.microsoft.com/office/word/2024/wordml/sdtformatlock" xmlns:w16se="http://schemas.microsoft.com/office/word/2015/wordml/symex" xmlns:wpg="http://schemas.microsoft.com/office/word/2010/wordprocessingGroup" xmlns:wpi="http://schemas.microsoft.com/office/word/2010/wordprocessingInk" xmlns:wne="http://schemas.microsoft.com/office/word/2006/wordml" xmlns:wps="http://schemas.microsoft.com/office/word/2010/wordprocessingShape" mc:Ignorable="w14 w15 w16se w16cid w16 w16cex w16sdtdh w16sdtfl w16du wp14">
+  <w:p>
+    <w:pPr>
+      <w:pStyle w:val="Piedepgina"/>
+    </w:pPr>
+  </w:p>
+</w:ftr>
+</file>
+
+<file path=word/footer2.xml><?xml version="1.0" encoding="utf-8"?>
+<w:ftr xmlns:wpc="http://schemas.microsoft.com/office/word/2010/wordprocessingCanvas" xmlns:cx="http://schemas.microsoft.com/office/drawing/2014/chartex" xmlns:cx1="http://schemas.microsoft.com/office/drawing/2015/9/8/chartex" xmlns:cx2="http://schemas.microsoft.com/office/drawing/2015/10/21/chartex" xmlns:cx3="http://schemas.microsoft.com/office/drawing/2016/5/9/chartex" xmlns:cx4="http://schemas.microsoft.com/office/drawing/2016/5/10/chartex" xmlns:cx5="http://schemas.microsoft.com/office/drawing/2016/5/11/chartex" xmlns:cx6="http://schemas.microsoft.com/office/drawing/2016/5/12/chartex" xmlns:cx7="http://schemas.microsoft.com/office/drawing/2016/5/13/chartex" xmlns:cx8="http://schemas.microsoft.com/office/drawing/2016/5/14/chartex" xmlns:mc="http://schemas.openxmlformats.org/markup-compatibility/2006" xmlns:aink="http://schemas.microsoft.com/office/drawing/2016/ink" xmlns:am3d="http://schemas.microsoft.com/office/drawing/2017/model3d" xmlns:o="urn:schemas-microsoft-com:office:office" xmlns:oel="http://schemas.microsoft.com/office/2019/extlst" xmlns:r="http://schemas.openxmlformats.org/officeDocument/2006/relationships" xmlns:m="http://schemas.openxmlformats.org/officeDocument/2006/math" xmlns:v="urn:schemas-microsoft-com:vml" xmlns:wp14="http://schemas.microsoft.com/office/word/2010/wordprocessingDrawing" xmlns:wp="http://schemas.openxmlformats.org/drawingml/2006/wordprocessingDrawing" xmlns:w10="urn:schemas-microsoft-com:office:word" xmlns:w="http://schemas.openxmlformats.org/wordprocessingml/2006/main" xmlns:w14="http://schemas.microsoft.com/office/word/2010/wordml" xmlns:w15="http://schemas.microsoft.com/office/word/2012/wordml" xmlns:w16cex="http://schemas.microsoft.com/office/word/2018/wordml/cex" xmlns:w16cid="http://schemas.microsoft.com/office/word/2016/wordml/cid" xmlns:w16="http://schemas.microsoft.com/office/word/2018/wordml" xmlns:w16du="http://schemas.microsoft.com/office/word/2023/wordml/word16du" xmlns:w16sdtdh="http://schemas.microsoft.com/office/word/2020/wordml/sdtdatahash" xmlns:w16sdtfl="http://schemas.microsoft.com/office/word/2024/wordml/sdtformatlock" xmlns:w16se="http://schemas.microsoft.com/office/word/2015/wordml/symex" xmlns:wpg="http://schemas.microsoft.com/office/word/2010/wordprocessingGroup" xmlns:wpi="http://schemas.microsoft.com/office/word/2010/wordprocessingInk" xmlns:wne="http://schemas.microsoft.com/office/word/2006/wordml" xmlns:wps="http://schemas.microsoft.com/office/word/2010/wordprocessingShape" mc:Ignorable="w14 w15 w16se w16cid w16 w16cex w16sdtdh w16sdtfl w16du wp14">
+  <w:p>
+    <w:pPr>
+      <w:pStyle w:val="Piedepgina"/>
+    </w:pPr>
+  </w:p>
+</w:ftr>
+</file>
+
+<file path=word/footer3.xml><?xml version="1.0" encoding="utf-8"?>
+<w:ftr xmlns:wpc="http://schemas.microsoft.com/office/word/2010/wordprocessingCanvas" xmlns:cx="http://schemas.microsoft.com/office/drawing/2014/chartex" xmlns:cx1="http://schemas.microsoft.com/office/drawing/2015/9/8/chartex" xmlns:cx2="http://schemas.microsoft.com/office/drawing/2015/10/21/chartex" xmlns:cx3="http://schemas.microsoft.com/office/drawing/2016/5/9/chartex" xmlns:cx4="http://schemas.microsoft.com/office/drawing/2016/5/10/chartex" xmlns:cx5="http://schemas.microsoft.com/office/drawing/2016/5/11/chartex" xmlns:cx6="http://schemas.microsoft.com/office/drawing/2016/5/12/chartex" xmlns:cx7="http://schemas.microsoft.com/office/drawing/2016/5/13/chartex" xmlns:cx8="http://schemas.microsoft.com/office/drawing/2016/5/14/chartex" xmlns:mc="http://schemas.openxmlformats.org/markup-compatibility/2006" xmlns:aink="http://schemas.microsoft.com/office/drawing/2016/ink" xmlns:am3d="http://schemas.microsoft.com/office/drawing/2017/model3d" xmlns:o="urn:schemas-microsoft-com:office:office" xmlns:oel="http://schemas.microsoft.com/office/2019/extlst" xmlns:r="http://schemas.openxmlformats.org/officeDocument/2006/relationships" xmlns:m="http://schemas.openxmlformats.org/officeDocument/2006/math" xmlns:v="urn:schemas-microsoft-com:vml" xmlns:wp14="http://schemas.microsoft.com/office/word/2010/wordprocessingDrawing" xmlns:wp="http://schemas.openxmlformats.org/drawingml/2006/wordprocessingDrawing" xmlns:w10="urn:schemas-microsoft-com:office:word" xmlns:w="http://schemas.openxmlformats.org/wordprocessingml/2006/main" xmlns:w14="http://schemas.microsoft.com/office/word/2010/wordml" xmlns:w15="http://schemas.microsoft.com/office/word/2012/wordml" xmlns:w16cex="http://schemas.microsoft.com/office/word/2018/wordml/cex" xmlns:w16cid="http://schemas.microsoft.com/office/word/2016/wordml/cid" xmlns:w16="http://schemas.microsoft.com/office/word/2018/wordml" xmlns:w16du="http://schemas.microsoft.com/office/word/2023/wordml/word16du" xmlns:w16sdtdh="http://schemas.microsoft.com/office/word/2020/wordml/sdtdatahash" xmlns:w16sdtfl="http://schemas.microsoft.com/office/word/2024/wordml/sdtformatlock" xmlns:w16se="http://schemas.microsoft.com/office/word/2015/wordml/symex" xmlns:wpg="http://schemas.microsoft.com/office/word/2010/wordprocessingGroup" xmlns:wpi="http://schemas.microsoft.com/office/word/2010/wordprocessingInk" xmlns:wne="http://schemas.microsoft.com/office/word/2006/wordml" xmlns:wps="http://schemas.microsoft.com/office/word/2010/wordprocessingShape" mc:Ignorable="w14 w15 w16se w16cid w16 w16cex w16sdtdh w16sdtfl w16du wp14">
+  <w:p>
+    <w:pPr>
+      <w:pStyle w:val="Piedepgina"/>
+    </w:pPr>
+  </w:p>
+</w:ftr>
+</file>
+
+<file path=word/footnotes.xml><?xml version="1.0" encoding="utf-8"?>
+<w:footnotes xmlns:wpc="http://schemas.microsoft.com/office/word/2010/wordprocessingCanvas" xmlns:cx="http://schemas.microsoft.com/office/drawing/2014/chartex" xmlns:cx1="http://schemas.microsoft.com/office/drawing/2015/9/8/chartex" xmlns:cx2="http://schemas.microsoft.com/office/drawing/2015/10/21/chartex" xmlns:cx3="http://schemas.microsoft.com/office/drawing/2016/5/9/chartex" xmlns:cx4="http://schemas.microsoft.com/office/drawing/2016/5/10/chartex" xmlns:cx5="http://schemas.microsoft.com/office/drawing/2016/5/11/chartex" xmlns:cx6="http://schemas.microsoft.com/office/drawing/2016/5/12/chartex" xmlns:cx7="http://schemas.microsoft.com/office/drawing/2016/5/13/chartex" xmlns:cx8="http://schemas.microsoft.com/office/drawing/2016/5/14/chartex" xmlns:mc="http://schemas.openxmlformats.org/markup-compatibility/2006" xmlns:aink="http://schemas.microsoft.com/office/drawing/2016/ink" xmlns:am3d="http://schemas.microsoft.com/office/drawing/2017/model3d" xmlns:o="urn:schemas-microsoft-com:office:office" xmlns:oel="http://schemas.microsoft.com/office/2019/extlst" xmlns:r="http://schemas.openxmlformats.org/officeDocument/2006/relationships" xmlns:m="http://schemas.openxmlformats.org/officeDocument/2006/math" xmlns:v="urn:schemas-microsoft-com:vml" xmlns:wp14="http://schemas.microsoft.com/office/word/2010/wordprocessingDrawing" xmlns:wp="http://schemas.openxmlformats.org/drawingml/2006/wordprocessingDrawing" xmlns:w10="urn:schemas-microsoft-com:office:word" xmlns:w="http://schemas.openxmlformats.org/wordprocessingml/2006/main" xmlns:w14="http://schemas.microsoft.com/office/word/2010/wordml" xmlns:w15="http://schemas.microsoft.com/office/word/2012/wordml" xmlns:w16cex="http://schemas.microsoft.com/office/word/2018/wordml/cex" xmlns:w16cid="http://schemas.microsoft.com/office/word/2016/wordml/cid" xmlns:w16="http://schemas.microsoft.com/office/word/2018/wordml" xmlns:w16du="http://schemas.microsoft.com/office/word/2023/wordml/word16du" xmlns:w16sdtdh="http://schemas.microsoft.com/office/word/2020/wordml/sdtdatahash" xmlns:w16sdtfl="http://schemas.microsoft.com/office/word/2024/wordml/sdtformatlock" xmlns:w16se="http://schemas.microsoft.com/office/word/2015/wordml/symex" xmlns:wpg="http://schemas.microsoft.com/office/word/2010/wordprocessingGroup" xmlns:wpi="http://schemas.microsoft.com/office/word/2010/wordprocessingInk" xmlns:wne="http://schemas.microsoft.com/office/word/2006/wordml" xmlns:wps="http://schemas.microsoft.com/office/word/2010/wordprocessingShape" mc:Ignorable="w14 w15 w16se w16cid w16 w16cex w16sdtdh w16sdtfl w16du wp14">
+  <w:footnote w:type="separator" w:id="-1">
+    <w:p>
+      <w:pPr>
+        <w:spacing w:after="0" w:line="240" w:lineRule="auto"/>
+      </w:pPr>
+      <w:r>
+        <w:separator/>
+      </w:r>
+    </w:p>
+  </w:footnote>
+  <w:footnote w:type="continuationSeparator" w:id="0">
+    <w:p>
+      <w:pPr>
+        <w:spacing w:after="0" w:line="240" w:lineRule="auto"/>
+      </w:pPr>
+      <w:r>
+        <w:continuationSeparator/>
+      </w:r>
+    </w:p>
+  </w:footnote>
+</w:footnotes>
+</file>
+
+<file path=word/header1.xml><?xml version="1.0" encoding="utf-8"?>
+<w:hdr xmlns:wpc="http://schemas.microsoft.com/office/word/2010/wordprocessingCanvas" xmlns:cx="http://schemas.microsoft.com/office/drawing/2014/chartex" xmlns:cx1="http://schemas.microsoft.com/office/drawing/2015/9/8/chartex" xmlns:cx2="http://schemas.microsoft.com/office/drawing/2015/10/21/chartex" xmlns:cx3="http://schemas.microsoft.com/office/drawing/2016/5/9/chartex" xmlns:cx4="http://schemas.microsoft.com/office/drawing/2016/5/10/chartex" xmlns:cx5="http://schemas.microsoft.com/office/drawing/2016/5/11/chartex" xmlns:cx6="http://schemas.microsoft.com/office/drawing/2016/5/12/chartex" xmlns:cx7="http://schemas.microsoft.com/office/drawing/2016/5/13/chartex" xmlns:cx8="http://schemas.microsoft.com/office/drawing/2016/5/14/chartex" xmlns:mc="http://schemas.openxmlformats.org/markup-compatibility/2006" xmlns:aink="http://schemas.microsoft.com/office/drawing/2016/ink" xmlns:am3d="http://schemas.microsoft.com/office/drawing/2017/model3d" xmlns:o="urn:schemas-microsoft-com:office:office" xmlns:oel="http://schemas.microsoft.com/office/2019/extlst" xmlns:r="http://schemas.openxmlformats.org/officeDocument/2006/relationships" xmlns:m="http://schemas.openxmlformats.org/officeDocument/2006/math" xmlns:v="urn:schemas-microsoft-com:vml" xmlns:wp14="http://schemas.microsoft.com/office/word/2010/wordprocessingDrawing" xmlns:wp="http://schemas.openxmlformats.org/drawingml/2006/wordprocessingDrawing" xmlns:w10="urn:schemas-microsoft-com:office:word" xmlns:w="http://schemas.openxmlformats.org/wordprocessingml/2006/main" xmlns:w14="http://schemas.microsoft.com/office/word/2010/wordml" xmlns:w15="http://schemas.microsoft.com/office/word/2012/wordml" xmlns:w16cex="http://schemas.microsoft.com/office/word/2018/wordml/cex" xmlns:w16cid="http://schemas.microsoft.com/office/word/2016/wordml/cid" xmlns:w16="http://schemas.microsoft.com/office/word/2018/wordml" xmlns:w16du="http://schemas.microsoft.com/office/word/2023/wordml/word16du" xmlns:w16sdtdh="http://schemas.microsoft.com/office/word/2020/wordml/sdtdatahash" xmlns:w16sdtfl="http://schemas.microsoft.com/office/word/2024/wordml/sdtformatlock" xmlns:w16se="http://schemas.microsoft.com/office/word/2015/wordml/symex" xmlns:wpg="http://schemas.microsoft.com/office/word/2010/wordprocessingGroup" xmlns:wpi="http://schemas.microsoft.com/office/word/2010/wordprocessingInk" xmlns:wne="http://schemas.microsoft.com/office/word/2006/wordml" xmlns:wps="http://schemas.microsoft.com/office/word/2010/wordprocessingShape" mc:Ignorable="w14 w15 w16se w16cid w16 w16cex w16sdtdh w16sdtfl w16du wp14">
+  <w:p>
+    <w:pPr>
+      <w:pStyle w:val="Encabezado"/>
+    </w:pPr>
+  </w:p>
+</w:hdr>
+</file>
+
+<file path=word/header2.xml><?xml version="1.0" encoding="utf-8"?>
+<w:hdr xmlns:wpc="http://schemas.microsoft.com/office/word/2010/wordprocessingCanvas" xmlns:cx="http://schemas.microsoft.com/office/drawing/2014/chartex" xmlns:cx1="http://schemas.microsoft.com/office/drawing/2015/9/8/chartex" xmlns:cx2="http://schemas.microsoft.com/office/drawing/2015/10/21/chartex" xmlns:cx3="http://schemas.microsoft.com/office/drawing/2016/5/9/chartex" xmlns:cx4="http://schemas.microsoft.com/office/drawing/2016/5/10/chartex" xmlns:cx5="http://schemas.microsoft.com/office/drawing/2016/5/11/chartex" xmlns:cx6="http://schemas.microsoft.com/office/drawing/2016/5/12/chartex" xmlns:cx7="http://schemas.microsoft.com/office/drawing/2016/5/13/chartex" xmlns:cx8="http://schemas.microsoft.com/office/drawing/2016/5/14/chartex" xmlns:mc="http://schemas.openxmlformats.org/markup-compatibility/2006" xmlns:aink="http://schemas.microsoft.com/office/drawing/2016/ink" xmlns:am3d="http://schemas.microsoft.com/office/drawing/2017/model3d" xmlns:o="urn:schemas-microsoft-com:office:office" xmlns:oel="http://schemas.microsoft.com/office/2019/extlst" xmlns:r="http://schemas.openxmlformats.org/officeDocument/2006/relationships" xmlns:m="http://schemas.openxmlformats.org/officeDocument/2006/math" xmlns:v="urn:schemas-microsoft-com:vml" xmlns:wp14="http://schemas.microsoft.com/office/word/2010/wordprocessingDrawing" xmlns:wp="http://schemas.openxmlformats.org/drawingml/2006/wordprocessingDrawing" xmlns:w10="urn:schemas-microsoft-com:office:word" xmlns:w="http://schemas.openxmlformats.org/wordprocessingml/2006/main" xmlns:w14="http://schemas.microsoft.com/office/word/2010/wordml" xmlns:w15="http://schemas.microsoft.com/office/word/2012/wordml" xmlns:w16cex="http://schemas.microsoft.com/office/word/2018/wordml/cex" xmlns:w16cid="http://schemas.microsoft.com/office/word/2016/wordml/cid" xmlns:w16="http://schemas.microsoft.com/office/word/2018/wordml" xmlns:w16du="http://schemas.microsoft.com/office/word/2023/wordml/word16du" xmlns:w16sdtdh="http://schemas.microsoft.com/office/word/2020/wordml/sdtdatahash" xmlns:w16sdtfl="http://schemas.microsoft.com/office/word/2024/wordml/sdtformatlock" xmlns:w16se="http://schemas.microsoft.com/office/word/2015/wordml/symex" xmlns:wpg="http://schemas.microsoft.com/office/word/2010/wordprocessingGroup" xmlns:wpi="http://schemas.microsoft.com/office/word/2010/wordprocessingInk" xmlns:wne="http://schemas.microsoft.com/office/word/2006/wordml" xmlns:wps="http://schemas.microsoft.com/office/word/2010/wordprocessingShape" mc:Ignorable="w14 w15 w16se w16cid w16 w16cex w16sdtdh w16sdtfl w16du wp14">
+  <w:p>
+    <w:pPr>
+      <w:pStyle w:val="Encabezado"/>
+    </w:pPr>
+  </w:p>
+</w:hdr>
+</file>
+
+<file path=word/header3.xml><?xml version="1.0" encoding="utf-8"?>
+<w:hdr xmlns:wpc="http://schemas.microsoft.com/office/word/2010/wordprocessingCanvas" xmlns:cx="http://schemas.microsoft.com/office/drawing/2014/chartex" xmlns:cx1="http://schemas.microsoft.com/office/drawing/2015/9/8/chartex" xmlns:cx2="http://schemas.microsoft.com/office/drawing/2015/10/21/chartex" xmlns:cx3="http://schemas.microsoft.com/office/drawing/2016/5/9/chartex" xmlns:cx4="http://schemas.microsoft.com/office/drawing/2016/5/10/chartex" xmlns:cx5="http://schemas.microsoft.com/office/drawing/2016/5/11/chartex" xmlns:cx6="http://schemas.microsoft.com/office/drawing/2016/5/12/chartex" xmlns:cx7="http://schemas.microsoft.com/office/drawing/2016/5/13/chartex" xmlns:cx8="http://schemas.microsoft.com/office/drawing/2016/5/14/chartex" xmlns:mc="http://schemas.openxmlformats.org/markup-compatibility/2006" xmlns:aink="http://schemas.microsoft.com/office/drawing/2016/ink" xmlns:am3d="http://schemas.microsoft.com/office/drawing/2017/model3d" xmlns:o="urn:schemas-microsoft-com:office:office" xmlns:oel="http://schemas.microsoft.com/office/2019/extlst" xmlns:r="http://schemas.openxmlformats.org/officeDocument/2006/relationships" xmlns:m="http://schemas.openxmlformats.org/officeDocument/2006/math" xmlns:v="urn:schemas-microsoft-com:vml" xmlns:wp14="http://schemas.microsoft.com/office/word/2010/wordprocessingDrawing" xmlns:wp="http://schemas.openxmlformats.org/drawingml/2006/wordprocessingDrawing" xmlns:w10="urn:schemas-microsoft-com:office:word" xmlns:w="http://schemas.openxmlformats.org/wordprocessingml/2006/main" xmlns:w14="http://schemas.microsoft.com/office/word/2010/wordml" xmlns:w15="http://schemas.microsoft.com/office/word/2012/wordml" xmlns:w16cex="http://schemas.microsoft.com/office/word/2018/wordml/cex" xmlns:w16cid="http://schemas.microsoft.com/office/word/2016/wordml/cid" xmlns:w16="http://schemas.microsoft.com/office/word/2018/wordml" xmlns:w16du="http://schemas.microsoft.com/office/word/2023/wordml/word16du" xmlns:w16sdtdh="http://schemas.microsoft.com/office/word/2020/wordml/sdtdatahash" xmlns:w16sdtfl="http://schemas.microsoft.com/office/word/2024/wordml/sdtformatlock" xmlns:w16se="http://schemas.microsoft.com/office/word/2015/wordml/symex" xmlns:wpg="http://schemas.microsoft.com/office/word/2010/wordprocessingGroup" xmlns:wpi="http://schemas.microsoft.com/office/word/2010/wordprocessingInk" xmlns:wne="http://schemas.microsoft.com/office/word/2006/wordml" xmlns:wps="http://schemas.microsoft.com/office/word/2010/wordprocessingShape" mc:Ignorable="w14 w15 w16se w16cid w16 w16cex w16sdtdh w16sdtfl w16du wp14">
+  <w:p>
+    <w:pPr>
+      <w:pStyle w:val="Encabezado"/>
+    </w:pPr>
+  </w:p>
+</w:hdr>
 </file>
 
 <file path=word/numbering.xml><?xml version="1.0" encoding="utf-8"?>
@@ -6654,6 +6794,50 @@
       <w:color w:val="0F4761" w:themeColor="accent1" w:themeShade="BF"/>
       <w:spacing w:val="5"/>
     </w:rPr>
+  </w:style>
+  <w:style w:type="paragraph" w:styleId="Encabezado">
+    <w:name w:val="header"/>
+    <w:basedOn w:val="Normal"/>
+    <w:link w:val="EncabezadoCar"/>
+    <w:uiPriority w:val="99"/>
+    <w:unhideWhenUsed/>
+    <w:rsid w:val="00101732"/>
+    <w:pPr>
+      <w:tabs>
+        <w:tab w:val="center" w:pos="4252"/>
+        <w:tab w:val="right" w:pos="8504"/>
+      </w:tabs>
+      <w:spacing w:after="0" w:line="240" w:lineRule="auto"/>
+    </w:pPr>
+  </w:style>
+  <w:style w:type="character" w:customStyle="1" w:styleId="EncabezadoCar">
+    <w:name w:val="Encabezado Car"/>
+    <w:basedOn w:val="Fuentedeprrafopredeter"/>
+    <w:link w:val="Encabezado"/>
+    <w:uiPriority w:val="99"/>
+    <w:rsid w:val="00101732"/>
+  </w:style>
+  <w:style w:type="paragraph" w:styleId="Piedepgina">
+    <w:name w:val="footer"/>
+    <w:basedOn w:val="Normal"/>
+    <w:link w:val="PiedepginaCar"/>
+    <w:uiPriority w:val="99"/>
+    <w:unhideWhenUsed/>
+    <w:rsid w:val="00101732"/>
+    <w:pPr>
+      <w:tabs>
+        <w:tab w:val="center" w:pos="4252"/>
+        <w:tab w:val="right" w:pos="8504"/>
+      </w:tabs>
+      <w:spacing w:after="0" w:line="240" w:lineRule="auto"/>
+    </w:pPr>
+  </w:style>
+  <w:style w:type="character" w:customStyle="1" w:styleId="PiedepginaCar">
+    <w:name w:val="Pie de página Car"/>
+    <w:basedOn w:val="Fuentedeprrafopredeter"/>
+    <w:link w:val="Piedepgina"/>
+    <w:uiPriority w:val="99"/>
+    <w:rsid w:val="00101732"/>
   </w:style>
 </w:styles>
 </file>

</xml_diff>